<commit_message>
fix: SEC-001 XSS — replace document.write with Blob URL in exportToPDF; audit script comment-line exclusion; score 9 PASS 0 FAIL 1 REVIEW [3.28]
</commit_message>
<xml_diff>
--- a/deliverables/Phase-4-Testing/EDMECA_Security_Audit_Report_2026-03-04.docx
+++ b/deliverables/Phase-4-Testing/EDMECA_Security_Audit_Report_2026-03-04.docx
@@ -254,7 +254,7 @@
                 <w:sz w:val="18"/>
                 <w:szCs w:val="18"/>
               </w:rPr>
-              <w:t xml:space="preserve">8</w:t>
+              <w:t xml:space="preserve">9</w:t>
             </w:r>
           </w:p>
         </w:tc>
@@ -318,7 +318,7 @@
                 <w:sz w:val="18"/>
                 <w:szCs w:val="18"/>
               </w:rPr>
-              <w:t xml:space="preserve">1</w:t>
+              <w:t xml:space="preserve">0</w:t>
             </w:r>
           </w:p>
         </w:tc>
@@ -510,7 +510,7 @@
                 <w:sz w:val="18"/>
                 <w:szCs w:val="18"/>
               </w:rPr>
-              <w:t xml:space="preserve">2026-03-04T10:59:05.216Z</w:t>
+              <w:t xml:space="preserve">2026-03-04T11:06:30.006Z</w:t>
             </w:r>
           </w:p>
         </w:tc>
@@ -1263,7 +1263,7 @@
     </w:p>
     <w:p>
       <w:pPr>
-        <w:shd w:color="C0392B" w:val="solid"/>
+        <w:shd w:color="27AE60" w:val="solid"/>
         <w:spacing w:before="300" w:after="0"/>
         <w:ind w:left="100" w:right="100"/>
       </w:pPr>
@@ -1285,7 +1285,7 @@
           <w:sz w:val="20"/>
           <w:szCs w:val="20"/>
         </w:rPr>
-        <w:t xml:space="preserve">   [FAIL]  Risk: High</w:t>
+        <w:t xml:space="preserve">   [PASS]  Risk: None</w:t>
       </w:r>
     </w:p>
     <w:tbl>
@@ -1468,7 +1468,7 @@
                 <w:sz w:val="18"/>
                 <w:szCs w:val="18"/>
               </w:rPr>
-              <w:t xml:space="preserve">FAIL</w:t>
+              <w:t xml:space="preserve">PASS</w:t>
             </w:r>
           </w:p>
         </w:tc>
@@ -1500,7 +1500,7 @@
                 <w:sz w:val="18"/>
                 <w:szCs w:val="18"/>
               </w:rPr>
-              <w:t xml:space="preserve">High</w:t>
+              <w:t xml:space="preserve">None</w:t>
             </w:r>
           </w:p>
         </w:tc>
@@ -1528,7 +1528,7 @@
         <w:spacing w:after="120"/>
       </w:pPr>
       <w:r>
-        <w:t xml:space="preserve">Checks for direct DOM manipulation patterns that bypass React's built-in XSS protection (dangerouslySetInnerHTML, innerHTML assignment, eval(), document.write()). React escapes content by default; these patterns override that protection.</w:t>
+        <w:t xml:space="preserve">Checks for direct DOM manipulation patterns that bypass React's built-in XSS protection (dangerouslySetInnerHTML, innerHTML assignment, eval(), document.write()). React escapes content by default; these patterns override that protection. Comment lines are excluded from the scan.</w:t>
       </w:r>
     </w:p>
     <w:p>
@@ -1548,7 +1548,7 @@
         <w:spacing w:after="120"/>
       </w:pPr>
       <w:r>
-        <w:t xml:space="preserve">1 potential XSS vector(s) found requiring review.</w:t>
+        <w:t xml:space="preserve">No direct DOM injection patterns found. React JSX rendering is used throughout, which escapes all user-supplied content by default. The PDF export function uses the Blob URL API instead of document.write().</w:t>
       </w:r>
     </w:p>
     <w:p>
@@ -1563,126 +1563,17 @@
         <w:t xml:space="preserve">Evidence</w:t>
       </w:r>
     </w:p>
-    <w:tbl>
-      <w:tblPr>
-        <w:tblW w:type="pct" w:w="100%"/>
-        <w:tblBorders>
-          <w:top w:val="single" w:color="AAAAAA" w:sz="2"/>
-          <w:left w:val="single" w:color="AAAAAA" w:sz="2"/>
-          <w:bottom w:val="single" w:color="AAAAAA" w:sz="2"/>
-          <w:right w:val="single" w:color="AAAAAA" w:sz="2"/>
-          <w:insideH w:val="single" w:color="auto" w:sz="4"/>
-          <w:insideV w:val="single" w:color="auto" w:sz="4"/>
-        </w:tblBorders>
-      </w:tblPr>
-      <w:tblGrid>
-        <w:gridCol w:w="100"/>
-        <w:gridCol w:w="100"/>
-        <w:gridCol w:w="100"/>
-      </w:tblGrid>
-      <w:tr>
-        <w:trPr>
-          <w:tblHeader/>
-        </w:trPr>
-        <w:tc>
-          <w:tcPr>
-            <w:shd w:color="2C3E50" w:val="solid"/>
-          </w:tcPr>
-          <w:p>
-            <w:r>
-              <w:rPr>
-                <w:b/>
-                <w:bCs/>
-                <w:color w:val="FFFFFF"/>
-                <w:sz w:val="16"/>
-                <w:szCs w:val="16"/>
-              </w:rPr>
-              <w:t xml:space="preserve">File</w:t>
-            </w:r>
-          </w:p>
-        </w:tc>
-        <w:tc>
-          <w:tcPr>
-            <w:shd w:color="2C3E50" w:val="solid"/>
-          </w:tcPr>
-          <w:p>
-            <w:r>
-              <w:rPr>
-                <w:b/>
-                <w:bCs/>
-                <w:color w:val="FFFFFF"/>
-                <w:sz w:val="16"/>
-                <w:szCs w:val="16"/>
-              </w:rPr>
-              <w:t xml:space="preserve">Line</w:t>
-            </w:r>
-          </w:p>
-        </w:tc>
-        <w:tc>
-          <w:tcPr>
-            <w:shd w:color="2C3E50" w:val="solid"/>
-          </w:tcPr>
-          <w:p>
-            <w:r>
-              <w:rPr>
-                <w:b/>
-                <w:bCs/>
-                <w:color w:val="FFFFFF"/>
-                <w:sz w:val="16"/>
-                <w:szCs w:val="16"/>
-              </w:rPr>
-              <w:t xml:space="preserve">Content / Advisory</w:t>
-            </w:r>
-          </w:p>
-        </w:tc>
-      </w:tr>
-      <w:tr>
-        <w:tc>
-          <w:tcPr>
-            <w:shd w:color="F0F0F0" w:val="solid"/>
-          </w:tcPr>
-          <w:p>
-            <w:r>
-              <w:rPr>
-                <w:rFonts w:ascii="Courier New" w:cs="Courier New" w:eastAsia="Courier New" w:hAnsi="Courier New"/>
-                <w:sz w:val="16"/>
-                <w:szCs w:val="16"/>
-              </w:rPr>
-              <w:t xml:space="preserve">client\src\lib\exportReport.ts</w:t>
-            </w:r>
-          </w:p>
-        </w:tc>
-        <w:tc>
-          <w:tcPr>
-            <w:shd w:color="F0F0F0" w:val="solid"/>
-          </w:tcPr>
-          <w:p>
-            <w:r>
-              <w:rPr>
-                <w:sz w:val="16"/>
-                <w:szCs w:val="16"/>
-              </w:rPr>
-              <w:t xml:space="preserve">235</w:t>
-            </w:r>
-          </w:p>
-        </w:tc>
-        <w:tc>
-          <w:tcPr>
-            <w:shd w:color="F0F0F0" w:val="solid"/>
-          </w:tcPr>
-          <w:p>
-            <w:r>
-              <w:rPr>
-                <w:rFonts w:ascii="Courier New" w:cs="Courier New" w:eastAsia="Courier New" w:hAnsi="Courier New"/>
-                <w:sz w:val="16"/>
-                <w:szCs w:val="16"/>
-              </w:rPr>
-              <w:t xml:space="preserve">printWin.document.write(`&lt;!DOCTYPE html&gt;</w:t>
-            </w:r>
-          </w:p>
-        </w:tc>
-      </w:tr>
-    </w:tbl>
+    <w:p>
+      <w:pPr>
+        <w:spacing w:after="120"/>
+      </w:pPr>
+      <w:r>
+        <w:rPr>
+          <w:color w:val="27AE60"/>
+        </w:rPr>
+        <w:t xml:space="preserve">No instances detected during automated scan of source files.</w:t>
+      </w:r>
+    </w:p>
     <w:p>
       <w:pPr>
         <w:spacing w:after="80"/>
@@ -6964,7 +6855,7 @@
                 <w:sz w:val="18"/>
                 <w:szCs w:val="18"/>
               </w:rPr>
-              <w:t xml:space="preserve">FAIL</w:t>
+              <w:t xml:space="preserve">PASS</w:t>
             </w:r>
           </w:p>
         </w:tc>
@@ -6979,7 +6870,7 @@
                 <w:sz w:val="18"/>
                 <w:szCs w:val="18"/>
               </w:rPr>
-              <w:t xml:space="preserve">High</w:t>
+              <w:t xml:space="preserve">None</w:t>
             </w:r>
           </w:p>
         </w:tc>
@@ -8461,7 +8352,7 @@
           <w:sz w:val="16"/>
           <w:szCs w:val="16"/>
         </w:rPr>
-        <w:t xml:space="preserve">Report generated: 2026-03-04T10:59:05.216Z  |  EDMECA Digital Academy  |  X4O Consulting</w:t>
+        <w:t xml:space="preserve">Report generated: 2026-03-04T11:06:30.006Z  |  EDMECA Digital Academy  |  X4O Consulting</w:t>
       </w:r>
     </w:p>
     <w:sectPr>

</xml_diff>